<commit_message>
readme and other update
</commit_message>
<xml_diff>
--- a/docs/stock-lms-prd.docx
+++ b/docs/stock-lms-prd.docx
@@ -7711,7 +7711,7 @@
                 <w:szCs w:val="19"/>
                 <w:rtl w:val="0"/>
               </w:rPr>
-              <w:t xml:space="preserve">            (id, email, password_hash, created_at, risk_profile, literacy_score)</w:t>
+              <w:t xml:space="preserve">            (id, name, email, password_hash, created_at, risk_profile, literacy_score)</w:t>
             </w:r>
             <w:r>
               <w:rPr>
@@ -8006,7 +8006,7 @@
         <w:rPr/>
         <w:drawing>
           <wp:inline distB="0" distT="0" distL="0" distR="0">
-            <wp:extent cx="6400800" cy="3600450"/>
+            <wp:extent cx="6400800" cy="3733800"/>
             <wp:effectExtent b="0" l="0" r="0" t="0"/>
             <wp:docPr id="1" name="image1.png"/>
             <a:graphic>
@@ -8026,7 +8026,7 @@
                   <pic:spPr>
                     <a:xfrm>
                       <a:off x="0" y="0"/>
-                      <a:ext cx="6400800" cy="3600450"/>
+                      <a:ext cx="6400800" cy="3733800"/>
                     </a:xfrm>
                     <a:prstGeom prst="rect"/>
                     <a:ln/>

</xml_diff>